<commit_message>
start.bat - proste uruchamianie dwuklikiem, aktualizacja instrukcji
</commit_message>
<xml_diff>
--- a/docs/instrukcja-uruchomienia.docx
+++ b/docs/instrukcja-uruchomienia.docx
@@ -189,7 +189,7 @@
           <w:sz w:val="22"/>
           <w:szCs w:val="22"/>
         </w:rPr>
-        <w:t xml:space="preserve">2. Otwórz wiersz poleceń w wypakowanym katalogu projektu i uruchom aplikację gotowym plikiem JAR:</w:t>
+        <w:t xml:space="preserve">2. Uruchom aplikację – najprościej klikając dwukrotnie plik start.bat. Alternatywnie otwórz wiersz poleceń w wypakowanym katalogu i wpisz:</w:t>
       </w:r>
     </w:p>
     <w:p>
@@ -221,7 +221,7 @@
           <w:sz w:val="22"/>
           <w:szCs w:val="22"/>
         </w:rPr>
-        <w:t xml:space="preserve">Alternatywnie, budując projekt ze źródeł (wymagany Maven 3.8+):</w:t>
+        <w:t xml:space="preserve">Można też zbudować projekt ze źródeł (wymagany Maven 3.8+):</w:t>
       </w:r>
     </w:p>
     <w:p>

</xml_diff>